<commit_message>
Add DRIP (CCS'26) and Nature Communications'26 papers to CV publications
Update editable CV source (Ruofan_Liu_CV.docx). PDF regeneration is
pending (libreoffice-writer unavailable in this environment).
</commit_message>
<xml_diff>
--- a/files/Ruofan_Liu_CV.docx
+++ b/files/Ruofan_Liu_CV.docx
@@ -1455,6 +1455,556 @@
         <w:gridCol w:w="7088"/>
         <w:gridCol w:w="1938"/>
       </w:tblGrid>
+      <w:tr>
+        <w:tc>
+          <w:tcPr>
+            <w:tcW w:w="7088" w:type="dxa"/>
+          </w:tcPr>
+          <w:p>
+            <w:pPr>
+              <w:pStyle w:val="ListParagraph"/>
+              <w:numPr>
+                <w:ilvl w:val="0"/>
+                <w:numId w:val="13"/>
+              </w:numPr>
+              <w:tabs>
+                <w:tab w:val="left" w:pos="360"/>
+                <w:tab w:val="right" w:pos="10060"/>
+              </w:tabs>
+              <w:autoSpaceDE w:val="0"/>
+              <w:autoSpaceDN w:val="0"/>
+              <w:adjustRightInd w:val="0"/>
+              <w:ind w:left="168" w:hanging="168"/>
+              <w:rPr>
+                <w:rFonts w:ascii="Arial" w:eastAsia="Songti TC" w:hAnsi="Arial" w:cs="Arial"/>
+                <w:b/>
+                <w:bCs/>
+                <w:color w:val="000000"/>
+                <w:kern w:val="0"/>
+                <w:sz w:val="20"/>
+                <w:szCs w:val="20"/>
+                <w:lang w:val="en-GB"/>
+              </w:rPr>
+            </w:pPr>
+            <w:proofErr w:type="spellStart"/>
+            <w:proofErr w:type="spellEnd"/>
+            <w:proofErr w:type="spellStart"/>
+            <w:proofErr w:type="spellEnd"/>
+            <w:proofErr w:type="spellStart"/>
+            <w:proofErr w:type="spellEnd"/>
+            <w:proofErr w:type="spellStart"/>
+            <w:proofErr w:type="spellEnd"/>
+            <w:proofErr w:type="spellStart"/>
+            <w:proofErr w:type="spellEnd"/>
+            <w:r>
+              <w:rPr>
+                <w:rFonts w:ascii="Arial" w:hAnsi="Arial"/>
+                <w:sz w:val="20"/>
+              </w:rPr>
+              <w:t xml:space="preserve"/>
+            </w:r>
+            <w:r>
+              <w:rPr>
+                <w:rFonts w:ascii="Arial" w:hAnsi="Arial"/>
+                <w:b/>
+                <w:sz w:val="20"/>
+              </w:rPr>
+              <w:t>Ruofan Liu</w:t>
+            </w:r>
+            <w:r>
+              <w:rPr>
+                <w:rFonts w:ascii="Arial" w:hAnsi="Arial"/>
+                <w:sz w:val="20"/>
+              </w:rPr>
+              <w:t xml:space="preserve">, Yun Lin, Zhiyong Huang, and Jin Song Dong. </w:t>
+            </w:r>
+            <w:r>
+              <w:rPr>
+                <w:rFonts w:ascii="Arial" w:hAnsi="Arial"/>
+                <w:sz w:val="20"/>
+              </w:rPr>
+              <w:t>“</w:t>
+            </w:r>
+            <w:r>
+              <w:rPr>
+                <w:rFonts w:ascii="Arial" w:hAnsi="Arial"/>
+                <w:i/>
+                <w:sz w:val="20"/>
+              </w:rPr>
+              <w:t>DRIP: Defending Prompt Injection via Token-wise Representation Editing and Residual Fusion</w:t>
+            </w:r>
+            <w:r>
+              <w:rPr>
+                <w:rFonts w:ascii="Arial" w:hAnsi="Arial"/>
+                <w:sz w:val="20"/>
+              </w:rPr>
+              <w:t>”.</w:t>
+            </w:r>
+          </w:p>
+          <w:p>
+            <w:pPr>
+              <w:pStyle w:val="ListParagraph"/>
+              <w:tabs>
+                <w:tab w:val="left" w:pos="360"/>
+                <w:tab w:val="right" w:pos="10060"/>
+              </w:tabs>
+              <w:autoSpaceDE w:val="0"/>
+              <w:autoSpaceDN w:val="0"/>
+              <w:adjustRightInd w:val="0"/>
+              <w:ind w:left="168"/>
+              <w:rPr>
+                <w:rFonts w:ascii="Arial" w:eastAsia="Songti TC" w:hAnsi="Arial" w:cs="Arial"/>
+                <w:b/>
+                <w:bCs/>
+                <w:color w:val="000000"/>
+                <w:kern w:val="0"/>
+                <w:sz w:val="20"/>
+                <w:szCs w:val="20"/>
+                <w:lang w:val="en-GB"/>
+              </w:rPr>
+            </w:pPr>
+          </w:p>
+        </w:tc>
+        <w:tc>
+          <w:tcPr>
+            <w:tcW w:w="1938" w:type="dxa"/>
+          </w:tcPr>
+          <w:p>
+            <w:pPr>
+              <w:tabs>
+                <w:tab w:val="left" w:pos="360"/>
+                <w:tab w:val="right" w:pos="10060"/>
+              </w:tabs>
+              <w:autoSpaceDE w:val="0"/>
+              <w:autoSpaceDN w:val="0"/>
+              <w:adjustRightInd w:val="0"/>
+              <w:rPr>
+                <w:rFonts w:ascii="Arial" w:eastAsia="Songti TC" w:hAnsi="Arial" w:cs="Arial"/>
+                <w:b/>
+                <w:bCs/>
+                <w:i/>
+                <w:iCs/>
+                <w:color w:val="000000"/>
+                <w:kern w:val="0"/>
+                <w:sz w:val="20"/>
+                <w:szCs w:val="20"/>
+                <w:lang w:val="en-GB"/>
+              </w:rPr>
+            </w:pPr>
+            <w:r>
+              <w:rPr>
+                <w:rFonts w:ascii="Arial" w:eastAsia="Songti TC" w:hAnsi="Arial" w:cs="Arial"/>
+                <w:i/>
+                <w:iCs/>
+                <w:noProof/>
+                <w:color w:val="000000"/>
+                <w:kern w:val="0"/>
+                <w:sz w:val="20"/>
+                <w:szCs w:val="20"/>
+                <w:lang w:val="en-GB"/>
+              </w:rPr>
+              <mc:AlternateContent>
+                <mc:Choice Requires="wps">
+                  <w:drawing>
+                    <wp:inline distT="0" distB="0" distL="0" distR="0" wp14:anchorId="4683C8EC" wp14:editId="48BFF06F">
+                      <wp:extent cx="1224280" cy="166862"/>
+                      <wp:effectExtent l="0" t="0" r="0" b="0"/>
+                      <wp:docPr id="397983921" name="Rectangle 3"/>
+                      <wp:cNvGraphicFramePr/>
+                      <a:graphic xmlns:a="http://schemas.openxmlformats.org/drawingml/2006/main">
+                        <a:graphicData uri="http://schemas.microsoft.com/office/word/2010/wordprocessingShape">
+                          <wps:wsp>
+                            <wps:cNvSpPr/>
+                            <wps:spPr>
+                              <a:xfrm>
+                                <a:off x="0" y="0"/>
+                                <a:ext cx="1224280" cy="166862"/>
+                              </a:xfrm>
+                              <a:prstGeom prst="rect">
+                                <a:avLst/>
+                              </a:prstGeom>
+                              <a:solidFill>
+                                <a:srgbClr val="C1DAFF"/>
+                              </a:solidFill>
+                              <a:ln>
+                                <a:noFill/>
+                              </a:ln>
+                            </wps:spPr>
+                            <wps:style>
+                              <a:lnRef idx="2">
+                                <a:schemeClr val="accent1">
+                                  <a:shade val="15000"/>
+                                </a:schemeClr>
+                              </a:lnRef>
+                              <a:fillRef idx="1">
+                                <a:schemeClr val="accent1"/>
+                              </a:fillRef>
+                              <a:effectRef idx="0">
+                                <a:schemeClr val="accent1"/>
+                              </a:effectRef>
+                              <a:fontRef idx="minor">
+                                <a:schemeClr val="lt1"/>
+                              </a:fontRef>
+                            </wps:style>
+                            <wps:txbx>
+                              <w:txbxContent>
+                                <w:p>
+                                  <w:pPr>
+                                    <w:jc w:val="center"/>
+                                    <w:rPr>
+                                      <w:rFonts w:ascii="Arial" w:hAnsi="Arial" w:cs="Arial"/>
+                                      <w:i/>
+                                      <w:iCs/>
+                                      <w:color w:val="000000" w:themeColor="text1"/>
+                                      <w:sz w:val="20"/>
+                                      <w:szCs w:val="20"/>
+                                      <w:lang w:val="en-US"/>
+                                    </w:rPr>
+                                  </w:pPr>
+                                  <w:r>
+                                    <w:rPr>
+                                      <w:rFonts w:ascii="Arial" w:hAnsi="Arial" w:cs="Arial"/>
+                                      <w:i/>
+                                      <w:iCs/>
+                                      <w:color w:val="000000" w:themeColor="text1"/>
+                                      <w:sz w:val="20"/>
+                                      <w:szCs w:val="20"/>
+                                      <w:lang w:val="en-US"/>
+                                    </w:rPr>
+                                    <w:t>CCS’26</w:t>
+                                  </w:r>
+                                </w:p>
+                              </w:txbxContent>
+                            </wps:txbx>
+                            <wps:bodyPr rot="0" spcFirstLastPara="0" vertOverflow="overflow" horzOverflow="overflow" vert="horz" wrap="square" lIns="0" tIns="0" rIns="0" bIns="0" numCol="1" spcCol="0" rtlCol="0" fromWordArt="0" anchor="ctr" anchorCtr="0" forceAA="0" compatLnSpc="1">
+                              <a:prstTxWarp prst="textNoShape">
+                                <a:avLst/>
+                              </a:prstTxWarp>
+                              <a:noAutofit/>
+                            </wps:bodyPr>
+                          </wps:wsp>
+                        </a:graphicData>
+                      </a:graphic>
+                    </wp:inline>
+                  </w:drawing>
+                </mc:Choice>
+                <mc:Fallback>
+                  <w:pict>
+                    <v:rect w14:anchorId="4683C8EC" id="Rectangle 3" o:spid="_x0000_s1026" style="width:96.4pt;height:13.15pt;visibility:visible;mso-wrap-style:square;mso-left-percent:-10001;mso-top-percent:-10001;mso-position-horizontal:absolute;mso-position-horizontal-relative:char;mso-position-vertical:absolute;mso-position-vertical-relative:line;mso-left-percent:-10001;mso-top-percent:-10001;v-text-anchor:middle" o:gfxdata="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" fillcolor="#c1daff" stroked="f" strokeweight="1pt">
+                      <v:textbox inset="0,0,0,0">
+                        <w:txbxContent>
+                          <w:p>
+                            <w:pPr>
+                              <w:jc w:val="center"/>
+                              <w:rPr>
+                                <w:rFonts w:ascii="Arial" w:hAnsi="Arial" w:cs="Arial"/>
+                                <w:i/>
+                                <w:iCs/>
+                                <w:color w:val="000000" w:themeColor="text1"/>
+                                <w:sz w:val="20"/>
+                                <w:szCs w:val="20"/>
+                                <w:lang w:val="en-US"/>
+                              </w:rPr>
+                            </w:pPr>
+                            <w:r>
+                              <w:rPr>
+                                <w:rFonts w:ascii="Arial" w:hAnsi="Arial" w:cs="Arial"/>
+                                <w:i/>
+                                <w:iCs/>
+                                <w:color w:val="000000" w:themeColor="text1"/>
+                                <w:sz w:val="20"/>
+                                <w:szCs w:val="20"/>
+                                <w:lang w:val="en-US"/>
+                              </w:rPr>
+                              <w:t>CCS’26</w:t>
+                            </w:r>
+                          </w:p>
+                        </w:txbxContent>
+                      </v:textbox>
+                      <w10:anchorlock/>
+                    </v:rect>
+                  </w:pict>
+                </mc:Fallback>
+              </mc:AlternateContent>
+            </w:r>
+          </w:p>
+        </w:tc>
+      </w:tr>
+      <w:tr>
+        <w:tc>
+          <w:tcPr>
+            <w:tcW w:w="7088" w:type="dxa"/>
+          </w:tcPr>
+          <w:p>
+            <w:pPr>
+              <w:pStyle w:val="ListParagraph"/>
+              <w:numPr>
+                <w:ilvl w:val="0"/>
+                <w:numId w:val="13"/>
+              </w:numPr>
+              <w:tabs>
+                <w:tab w:val="left" w:pos="360"/>
+                <w:tab w:val="right" w:pos="10060"/>
+              </w:tabs>
+              <w:autoSpaceDE w:val="0"/>
+              <w:autoSpaceDN w:val="0"/>
+              <w:adjustRightInd w:val="0"/>
+              <w:ind w:left="168" w:hanging="168"/>
+              <w:rPr>
+                <w:rFonts w:ascii="Arial" w:eastAsia="Songti TC" w:hAnsi="Arial" w:cs="Arial"/>
+                <w:b/>
+                <w:bCs/>
+                <w:color w:val="000000"/>
+                <w:kern w:val="0"/>
+                <w:sz w:val="20"/>
+                <w:szCs w:val="20"/>
+                <w:lang w:val="en-GB"/>
+              </w:rPr>
+            </w:pPr>
+            <w:proofErr w:type="spellStart"/>
+            <w:proofErr w:type="spellEnd"/>
+            <w:proofErr w:type="spellStart"/>
+            <w:proofErr w:type="spellEnd"/>
+            <w:proofErr w:type="spellStart"/>
+            <w:proofErr w:type="spellEnd"/>
+            <w:proofErr w:type="spellStart"/>
+            <w:proofErr w:type="spellEnd"/>
+            <w:proofErr w:type="spellStart"/>
+            <w:proofErr w:type="spellEnd"/>
+            <w:r>
+              <w:rPr>
+                <w:rFonts w:ascii="Arial" w:hAnsi="Arial"/>
+                <w:sz w:val="20"/>
+              </w:rPr>
+              <w:t xml:space="preserve">Keke Ding, Ruimin Xu, Xiaowen Chao, Mengci Li, Tao Sun, Tianbiao Yang, Min Zhu, Xufei Peng, </w:t>
+            </w:r>
+            <w:r>
+              <w:rPr>
+                <w:rFonts w:ascii="Arial" w:hAnsi="Arial"/>
+                <w:b/>
+                <w:sz w:val="20"/>
+              </w:rPr>
+              <w:t>Ruofan Liu</w:t>
+            </w:r>
+            <w:r>
+              <w:rPr>
+                <w:rFonts w:ascii="Arial" w:hAnsi="Arial"/>
+                <w:sz w:val="20"/>
+              </w:rPr>
+              <w:t xml:space="preserve">, Peiyang Luo, Guoli Tian, Yun Lin, Guoxiang Xie, Xiaojiao Zheng, Lu Zhang, Wei Jia, and Tianlu Chen. </w:t>
+            </w:r>
+            <w:r>
+              <w:rPr>
+                <w:rFonts w:ascii="Arial" w:hAnsi="Arial"/>
+                <w:sz w:val="20"/>
+              </w:rPr>
+              <w:t>“</w:t>
+            </w:r>
+            <w:r>
+              <w:rPr>
+                <w:rFonts w:ascii="Arial" w:hAnsi="Arial"/>
+                <w:i/>
+                <w:sz w:val="20"/>
+              </w:rPr>
+              <w:t>Amino acid-based biological age clock and its implications for human health and aging</w:t>
+            </w:r>
+            <w:r>
+              <w:rPr>
+                <w:rFonts w:ascii="Arial" w:hAnsi="Arial"/>
+                <w:sz w:val="20"/>
+              </w:rPr>
+              <w:t>”.</w:t>
+            </w:r>
+          </w:p>
+          <w:p>
+            <w:pPr>
+              <w:pStyle w:val="ListParagraph"/>
+              <w:tabs>
+                <w:tab w:val="left" w:pos="360"/>
+                <w:tab w:val="right" w:pos="10060"/>
+              </w:tabs>
+              <w:autoSpaceDE w:val="0"/>
+              <w:autoSpaceDN w:val="0"/>
+              <w:adjustRightInd w:val="0"/>
+              <w:ind w:left="168"/>
+              <w:rPr>
+                <w:rFonts w:ascii="Arial" w:eastAsia="Songti TC" w:hAnsi="Arial" w:cs="Arial"/>
+                <w:b/>
+                <w:bCs/>
+                <w:color w:val="000000"/>
+                <w:kern w:val="0"/>
+                <w:sz w:val="20"/>
+                <w:szCs w:val="20"/>
+                <w:lang w:val="en-GB"/>
+              </w:rPr>
+            </w:pPr>
+          </w:p>
+        </w:tc>
+        <w:tc>
+          <w:tcPr>
+            <w:tcW w:w="1938" w:type="dxa"/>
+          </w:tcPr>
+          <w:p>
+            <w:pPr>
+              <w:tabs>
+                <w:tab w:val="left" w:pos="360"/>
+                <w:tab w:val="right" w:pos="10060"/>
+              </w:tabs>
+              <w:autoSpaceDE w:val="0"/>
+              <w:autoSpaceDN w:val="0"/>
+              <w:adjustRightInd w:val="0"/>
+              <w:rPr>
+                <w:rFonts w:ascii="Arial" w:eastAsia="Songti TC" w:hAnsi="Arial" w:cs="Arial"/>
+                <w:b/>
+                <w:bCs/>
+                <w:i/>
+                <w:iCs/>
+                <w:color w:val="000000"/>
+                <w:kern w:val="0"/>
+                <w:sz w:val="20"/>
+                <w:szCs w:val="20"/>
+                <w:lang w:val="en-GB"/>
+              </w:rPr>
+            </w:pPr>
+            <w:r>
+              <w:rPr>
+                <w:rFonts w:ascii="Arial" w:eastAsia="Songti TC" w:hAnsi="Arial" w:cs="Arial"/>
+                <w:i/>
+                <w:iCs/>
+                <w:noProof/>
+                <w:color w:val="000000"/>
+                <w:kern w:val="0"/>
+                <w:sz w:val="20"/>
+                <w:szCs w:val="20"/>
+                <w:lang w:val="en-GB"/>
+              </w:rPr>
+              <mc:AlternateContent>
+                <mc:Choice Requires="wps">
+                  <w:drawing>
+                    <wp:inline distT="0" distB="0" distL="0" distR="0" wp14:anchorId="4683C8EC" wp14:editId="48BFF06F">
+                      <wp:extent cx="1480000" cy="166862"/>
+                      <wp:effectExtent l="0" t="0" r="0" b="0"/>
+                      <wp:docPr id="397983921" name="Rectangle 3"/>
+                      <wp:cNvGraphicFramePr/>
+                      <a:graphic xmlns:a="http://schemas.openxmlformats.org/drawingml/2006/main">
+                        <a:graphicData uri="http://schemas.microsoft.com/office/word/2010/wordprocessingShape">
+                          <wps:wsp>
+                            <wps:cNvSpPr/>
+                            <wps:spPr>
+                              <a:xfrm>
+                                <a:off x="0" y="0"/>
+                                <a:ext cx="1480000" cy="166862"/>
+                              </a:xfrm>
+                              <a:prstGeom prst="rect">
+                                <a:avLst/>
+                              </a:prstGeom>
+                              <a:solidFill>
+                                <a:srgbClr val="C1DAFF"/>
+                              </a:solidFill>
+                              <a:ln>
+                                <a:noFill/>
+                              </a:ln>
+                            </wps:spPr>
+                            <wps:style>
+                              <a:lnRef idx="2">
+                                <a:schemeClr val="accent1">
+                                  <a:shade val="15000"/>
+                                </a:schemeClr>
+                              </a:lnRef>
+                              <a:fillRef idx="1">
+                                <a:schemeClr val="accent1"/>
+                              </a:fillRef>
+                              <a:effectRef idx="0">
+                                <a:schemeClr val="accent1"/>
+                              </a:effectRef>
+                              <a:fontRef idx="minor">
+                                <a:schemeClr val="lt1"/>
+                              </a:fontRef>
+                            </wps:style>
+                            <wps:txbx>
+                              <w:txbxContent>
+                                <w:p>
+                                  <w:pPr>
+                                    <w:jc w:val="center"/>
+                                    <w:rPr>
+                                      <w:rFonts w:ascii="Arial" w:hAnsi="Arial" w:cs="Arial"/>
+                                      <w:i/>
+                                      <w:iCs/>
+                                      <w:color w:val="000000" w:themeColor="text1"/>
+                                      <w:sz w:val="20"/>
+                                      <w:szCs w:val="20"/>
+                                      <w:lang w:val="en-US"/>
+                                    </w:rPr>
+                                  </w:pPr>
+                                  <w:r>
+                                    <w:rPr>
+                                      <w:rFonts w:ascii="Arial" w:hAnsi="Arial" w:cs="Arial"/>
+                                      <w:i/>
+                                      <w:iCs/>
+                                      <w:color w:val="000000" w:themeColor="text1"/>
+                                      <w:sz w:val="20"/>
+                                      <w:szCs w:val="20"/>
+                                      <w:lang w:val="en-US"/>
+                                    </w:rPr>
+                                    <w:t>Nat. Commun.’26</w:t>
+                                  </w:r>
+                                </w:p>
+                              </w:txbxContent>
+                            </wps:txbx>
+                            <wps:bodyPr rot="0" spcFirstLastPara="0" vertOverflow="overflow" horzOverflow="overflow" vert="horz" wrap="square" lIns="0" tIns="0" rIns="0" bIns="0" numCol="1" spcCol="0" rtlCol="0" fromWordArt="0" anchor="ctr" anchorCtr="0" forceAA="0" compatLnSpc="1">
+                              <a:prstTxWarp prst="textNoShape">
+                                <a:avLst/>
+                              </a:prstTxWarp>
+                              <a:noAutofit/>
+                            </wps:bodyPr>
+                          </wps:wsp>
+                        </a:graphicData>
+                      </a:graphic>
+                    </wp:inline>
+                  </w:drawing>
+                </mc:Choice>
+                <mc:Fallback>
+                  <w:pict>
+                    <v:rect w14:anchorId="4683C8EC" id="Rectangle 3" o:spid="_x0000_s1026" style="width:96.4pt;height:13.15pt;visibility:visible;mso-wrap-style:square;mso-left-percent:-10001;mso-top-percent:-10001;mso-position-horizontal:absolute;mso-position-horizontal-relative:char;mso-position-vertical:absolute;mso-position-vertical-relative:line;mso-left-percent:-10001;mso-top-percent:-10001;v-text-anchor:middle" o:gfxdata="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" fillcolor="#c1daff" stroked="f" strokeweight="1pt">
+                      <v:textbox inset="0,0,0,0">
+                        <w:txbxContent>
+                          <w:p>
+                            <w:pPr>
+                              <w:jc w:val="center"/>
+                              <w:rPr>
+                                <w:rFonts w:ascii="Arial" w:hAnsi="Arial" w:cs="Arial"/>
+                                <w:i/>
+                                <w:iCs/>
+                                <w:color w:val="000000" w:themeColor="text1"/>
+                                <w:sz w:val="20"/>
+                                <w:szCs w:val="20"/>
+                                <w:lang w:val="en-US"/>
+                              </w:rPr>
+                            </w:pPr>
+                            <w:r>
+                              <w:rPr>
+                                <w:rFonts w:ascii="Arial" w:hAnsi="Arial" w:cs="Arial"/>
+                                <w:i/>
+                                <w:iCs/>
+                                <w:color w:val="000000" w:themeColor="text1"/>
+                                <w:sz w:val="20"/>
+                                <w:szCs w:val="20"/>
+                                <w:lang w:val="en-US"/>
+                              </w:rPr>
+                              <w:t>Nat. Commun.’26</w:t>
+                            </w:r>
+                          </w:p>
+                        </w:txbxContent>
+                      </v:textbox>
+                      <w10:anchorlock/>
+                    </v:rect>
+                  </w:pict>
+                </mc:Fallback>
+              </mc:AlternateContent>
+            </w:r>
+          </w:p>
+        </w:tc>
+      </w:tr>
       <w:tr>
         <w:tc>
           <w:tcPr>

</xml_diff>

<commit_message>
Mark TrainRef (ICLR 2026) as co-corresponding author
Add (Co-corresponding author) note to the TrainRef entry in the
publications page and the CV (docx + regenerated PDF).
</commit_message>
<xml_diff>
--- a/files/Ruofan_Liu_CV.docx
+++ b/files/Ruofan_Liu_CV.docx
@@ -2371,6 +2371,13 @@
                 <w:sz w:val="20"/>
               </w:rPr>
               <w:t>”.</w:t>
+            </w:r>
+            <w:r>
+              <w:rPr>
+                <w:rFonts w:ascii="Arial" w:hAnsi="Arial"/>
+                <w:sz w:val="20"/>
+              </w:rPr>
+              <w:t xml:space="preserve"> (Co-corresponding author)</w:t>
             </w:r>
           </w:p>
           <w:p>

</xml_diff>

<commit_message>
Add PiMRef (ACM CCS 2026) paper to CV publications
Add PiMRef: Deducing Ever-evolving Spear-phishing Emails with Knowledge
Base Invariants to the CV (docx + regenerated PDF), placed with the other
CCS'26 paper.
</commit_message>
<xml_diff>
--- a/files/Ruofan_Liu_CV.docx
+++ b/files/Ruofan_Liu_CV.docx
@@ -1532,6 +1532,281 @@
                 <w:sz w:val="20"/>
               </w:rPr>
               <w:t>DRIP: Defending Prompt Injection via Token-wise Representation Editing and Residual Fusion</w:t>
+            </w:r>
+            <w:r>
+              <w:rPr>
+                <w:rFonts w:ascii="Arial" w:hAnsi="Arial"/>
+                <w:sz w:val="20"/>
+              </w:rPr>
+              <w:t>”.</w:t>
+            </w:r>
+          </w:p>
+          <w:p>
+            <w:pPr>
+              <w:pStyle w:val="ListParagraph"/>
+              <w:tabs>
+                <w:tab w:val="left" w:pos="360"/>
+                <w:tab w:val="right" w:pos="10060"/>
+              </w:tabs>
+              <w:autoSpaceDE w:val="0"/>
+              <w:autoSpaceDN w:val="0"/>
+              <w:adjustRightInd w:val="0"/>
+              <w:ind w:left="168"/>
+              <w:rPr>
+                <w:rFonts w:ascii="Arial" w:eastAsia="Songti TC" w:hAnsi="Arial" w:cs="Arial"/>
+                <w:b/>
+                <w:bCs/>
+                <w:color w:val="000000"/>
+                <w:kern w:val="0"/>
+                <w:sz w:val="20"/>
+                <w:szCs w:val="20"/>
+                <w:lang w:val="en-GB"/>
+              </w:rPr>
+            </w:pPr>
+          </w:p>
+        </w:tc>
+        <w:tc>
+          <w:tcPr>
+            <w:tcW w:w="1938" w:type="dxa"/>
+          </w:tcPr>
+          <w:p>
+            <w:pPr>
+              <w:tabs>
+                <w:tab w:val="left" w:pos="360"/>
+                <w:tab w:val="right" w:pos="10060"/>
+              </w:tabs>
+              <w:autoSpaceDE w:val="0"/>
+              <w:autoSpaceDN w:val="0"/>
+              <w:adjustRightInd w:val="0"/>
+              <w:rPr>
+                <w:rFonts w:ascii="Arial" w:eastAsia="Songti TC" w:hAnsi="Arial" w:cs="Arial"/>
+                <w:b/>
+                <w:bCs/>
+                <w:i/>
+                <w:iCs/>
+                <w:color w:val="000000"/>
+                <w:kern w:val="0"/>
+                <w:sz w:val="20"/>
+                <w:szCs w:val="20"/>
+                <w:lang w:val="en-GB"/>
+              </w:rPr>
+            </w:pPr>
+            <w:r>
+              <w:rPr>
+                <w:rFonts w:ascii="Arial" w:eastAsia="Songti TC" w:hAnsi="Arial" w:cs="Arial"/>
+                <w:i/>
+                <w:iCs/>
+                <w:noProof/>
+                <w:color w:val="000000"/>
+                <w:kern w:val="0"/>
+                <w:sz w:val="20"/>
+                <w:szCs w:val="20"/>
+                <w:lang w:val="en-GB"/>
+              </w:rPr>
+              <mc:AlternateContent>
+                <mc:Choice Requires="wps">
+                  <w:drawing>
+                    <wp:inline distT="0" distB="0" distL="0" distR="0" wp14:anchorId="4683C8EC" wp14:editId="48BFF06F">
+                      <wp:extent cx="1224280" cy="166862"/>
+                      <wp:effectExtent l="0" t="0" r="0" b="0"/>
+                      <wp:docPr id="397983921" name="Rectangle 3"/>
+                      <wp:cNvGraphicFramePr/>
+                      <a:graphic xmlns:a="http://schemas.openxmlformats.org/drawingml/2006/main">
+                        <a:graphicData uri="http://schemas.microsoft.com/office/word/2010/wordprocessingShape">
+                          <wps:wsp>
+                            <wps:cNvSpPr/>
+                            <wps:spPr>
+                              <a:xfrm>
+                                <a:off x="0" y="0"/>
+                                <a:ext cx="1224280" cy="166862"/>
+                              </a:xfrm>
+                              <a:prstGeom prst="rect">
+                                <a:avLst/>
+                              </a:prstGeom>
+                              <a:solidFill>
+                                <a:srgbClr val="C1DAFF"/>
+                              </a:solidFill>
+                              <a:ln>
+                                <a:noFill/>
+                              </a:ln>
+                            </wps:spPr>
+                            <wps:style>
+                              <a:lnRef idx="2">
+                                <a:schemeClr val="accent1">
+                                  <a:shade val="15000"/>
+                                </a:schemeClr>
+                              </a:lnRef>
+                              <a:fillRef idx="1">
+                                <a:schemeClr val="accent1"/>
+                              </a:fillRef>
+                              <a:effectRef idx="0">
+                                <a:schemeClr val="accent1"/>
+                              </a:effectRef>
+                              <a:fontRef idx="minor">
+                                <a:schemeClr val="lt1"/>
+                              </a:fontRef>
+                            </wps:style>
+                            <wps:txbx>
+                              <w:txbxContent>
+                                <w:p>
+                                  <w:pPr>
+                                    <w:jc w:val="center"/>
+                                    <w:rPr>
+                                      <w:rFonts w:ascii="Arial" w:hAnsi="Arial" w:cs="Arial"/>
+                                      <w:i/>
+                                      <w:iCs/>
+                                      <w:color w:val="000000" w:themeColor="text1"/>
+                                      <w:sz w:val="20"/>
+                                      <w:szCs w:val="20"/>
+                                      <w:lang w:val="en-US"/>
+                                    </w:rPr>
+                                  </w:pPr>
+                                  <w:r>
+                                    <w:rPr>
+                                      <w:rFonts w:ascii="Arial" w:hAnsi="Arial" w:cs="Arial"/>
+                                      <w:i/>
+                                      <w:iCs/>
+                                      <w:color w:val="000000" w:themeColor="text1"/>
+                                      <w:sz w:val="20"/>
+                                      <w:szCs w:val="20"/>
+                                      <w:lang w:val="en-US"/>
+                                    </w:rPr>
+                                    <w:t>CCS’26</w:t>
+                                  </w:r>
+                                </w:p>
+                              </w:txbxContent>
+                            </wps:txbx>
+                            <wps:bodyPr rot="0" spcFirstLastPara="0" vertOverflow="overflow" horzOverflow="overflow" vert="horz" wrap="square" lIns="0" tIns="0" rIns="0" bIns="0" numCol="1" spcCol="0" rtlCol="0" fromWordArt="0" anchor="ctr" anchorCtr="0" forceAA="0" compatLnSpc="1">
+                              <a:prstTxWarp prst="textNoShape">
+                                <a:avLst/>
+                              </a:prstTxWarp>
+                              <a:noAutofit/>
+                            </wps:bodyPr>
+                          </wps:wsp>
+                        </a:graphicData>
+                      </a:graphic>
+                    </wp:inline>
+                  </w:drawing>
+                </mc:Choice>
+                <mc:Fallback>
+                  <w:pict>
+                    <v:rect w14:anchorId="4683C8EC" id="Rectangle 3" o:spid="_x0000_s1026" style="width:96.4pt;height:13.15pt;visibility:visible;mso-wrap-style:square;mso-left-percent:-10001;mso-top-percent:-10001;mso-position-horizontal:absolute;mso-position-horizontal-relative:char;mso-position-vertical:absolute;mso-position-vertical-relative:line;mso-left-percent:-10001;mso-top-percent:-10001;v-text-anchor:middle" o:gfxdata="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" fillcolor="#c1daff" stroked="f" strokeweight="1pt">
+                      <v:textbox inset="0,0,0,0">
+                        <w:txbxContent>
+                          <w:p>
+                            <w:pPr>
+                              <w:jc w:val="center"/>
+                              <w:rPr>
+                                <w:rFonts w:ascii="Arial" w:hAnsi="Arial" w:cs="Arial"/>
+                                <w:i/>
+                                <w:iCs/>
+                                <w:color w:val="000000" w:themeColor="text1"/>
+                                <w:sz w:val="20"/>
+                                <w:szCs w:val="20"/>
+                                <w:lang w:val="en-US"/>
+                              </w:rPr>
+                            </w:pPr>
+                            <w:r>
+                              <w:rPr>
+                                <w:rFonts w:ascii="Arial" w:hAnsi="Arial" w:cs="Arial"/>
+                                <w:i/>
+                                <w:iCs/>
+                                <w:color w:val="000000" w:themeColor="text1"/>
+                                <w:sz w:val="20"/>
+                                <w:szCs w:val="20"/>
+                                <w:lang w:val="en-US"/>
+                              </w:rPr>
+                              <w:t>CCS’26</w:t>
+                            </w:r>
+                          </w:p>
+                        </w:txbxContent>
+                      </v:textbox>
+                      <w10:anchorlock/>
+                    </v:rect>
+                  </w:pict>
+                </mc:Fallback>
+              </mc:AlternateContent>
+            </w:r>
+          </w:p>
+        </w:tc>
+      </w:tr>
+      <w:tr>
+        <w:tc>
+          <w:tcPr>
+            <w:tcW w:w="7088" w:type="dxa"/>
+          </w:tcPr>
+          <w:p>
+            <w:pPr>
+              <w:pStyle w:val="ListParagraph"/>
+              <w:numPr>
+                <w:ilvl w:val="0"/>
+                <w:numId w:val="13"/>
+              </w:numPr>
+              <w:tabs>
+                <w:tab w:val="left" w:pos="360"/>
+                <w:tab w:val="right" w:pos="10060"/>
+              </w:tabs>
+              <w:autoSpaceDE w:val="0"/>
+              <w:autoSpaceDN w:val="0"/>
+              <w:adjustRightInd w:val="0"/>
+              <w:ind w:left="168" w:hanging="168"/>
+              <w:rPr>
+                <w:rFonts w:ascii="Arial" w:eastAsia="Songti TC" w:hAnsi="Arial" w:cs="Arial"/>
+                <w:b/>
+                <w:bCs/>
+                <w:color w:val="000000"/>
+                <w:kern w:val="0"/>
+                <w:sz w:val="20"/>
+                <w:szCs w:val="20"/>
+                <w:lang w:val="en-GB"/>
+              </w:rPr>
+            </w:pPr>
+            <w:proofErr w:type="spellStart"/>
+            <w:proofErr w:type="spellEnd"/>
+            <w:proofErr w:type="spellStart"/>
+            <w:proofErr w:type="spellEnd"/>
+            <w:proofErr w:type="spellStart"/>
+            <w:proofErr w:type="spellEnd"/>
+            <w:proofErr w:type="spellStart"/>
+            <w:proofErr w:type="spellEnd"/>
+            <w:proofErr w:type="spellStart"/>
+            <w:proofErr w:type="spellEnd"/>
+            <w:r>
+              <w:rPr>
+                <w:rFonts w:ascii="Arial" w:hAnsi="Arial"/>
+                <w:sz w:val="20"/>
+              </w:rPr>
+              <w:t xml:space="preserve"/>
+            </w:r>
+            <w:r>
+              <w:rPr>
+                <w:rFonts w:ascii="Arial" w:hAnsi="Arial"/>
+                <w:b/>
+                <w:sz w:val="20"/>
+              </w:rPr>
+              <w:t>Ruofan Liu</w:t>
+            </w:r>
+            <w:r>
+              <w:rPr>
+                <w:rFonts w:ascii="Arial" w:hAnsi="Arial"/>
+                <w:sz w:val="20"/>
+              </w:rPr>
+              <w:t xml:space="preserve">, Yun Lin, Yuxin Wang, Xiwen Teoh, Zhenkai Liang, Gongshen Liu, Haojin Zhu, and Jin Song Dong. </w:t>
+            </w:r>
+            <w:r>
+              <w:rPr>
+                <w:rFonts w:ascii="Arial" w:hAnsi="Arial"/>
+                <w:sz w:val="20"/>
+              </w:rPr>
+              <w:t>“</w:t>
+            </w:r>
+            <w:r>
+              <w:rPr>
+                <w:rFonts w:ascii="Arial" w:hAnsi="Arial"/>
+                <w:i/>
+                <w:sz w:val="20"/>
+              </w:rPr>
+              <w:t>PiMRef: Deducing Ever-evolving Spear-phishing Emails with Knowledge Base Invariants</w:t>
             </w:r>
             <w:r>
               <w:rPr>

</xml_diff>